<commit_message>
Expand reel 6 (hidden sensory sensitivity) with detailed examples and layered solutions
Adds concrete sensory-trigger examples across hearing, sight, touch,
smell, and movement, a fuller cumulative-load school-day narrative, and
a tiered solution list (immediate tools, environmental adjustments,
communication signal, individual sensory plan, caregiver education).
</commit_message>
<xml_diff>
--- a/content/reels/neurodiversity-reels-scripts-arabic.docx
+++ b/content/reels/neurodiversity-reels-scripts-arabic.docx
@@ -1206,6 +1206,24 @@
     </w:p>
     <w:p>
       <w:pPr>
+        <w:spacing w:after="160"/>
+        <w:jc w:val="right"/>
+        <w:bidi/>
+      </w:pPr>
+      <w:r>
+        <w:rPr>
+          <w:rFonts w:ascii="Arial" w:hAnsi="Arial" w:cs="Arial"/>
+          <w:b w:val="0"/>
+          <w:i/>
+          <w:color w:val="888888"/>
+          <w:sz w:val="20"/>
+          <w:rtl/>
+        </w:rPr>
+        <w:t>(نسخة موسّعة — ٩٠-١٢٠ ثانية، أو تُقسّم إلى ريلين متتاليين ١/٢ و٢/٢)</w:t>
+      </w:r>
+    </w:p>
+    <w:p>
+      <w:pPr>
         <w:spacing w:after="120"/>
         <w:jc w:val="right"/>
         <w:bidi/>
@@ -1227,7 +1245,7 @@
           <w:sz w:val="24"/>
           <w:rtl/>
         </w:rPr>
-        <w:t>الضوء، الصوت، الملابس… أشياء بسيطة ممكن تكون تعذيب يومي لبعض الناس.</w:t>
+        <w:t>الضوء، الصوت، الملابس… أشياء بسيطة ممكن تكون تعذيب يومي لبعض الناس، وما حد يلاحظ.</w:t>
       </w:r>
     </w:p>
     <w:p>
@@ -1253,7 +1271,7 @@
           <w:sz w:val="24"/>
           <w:rtl/>
         </w:rPr>
-        <w:t>الحساسيات الحسية عند الفتيات التوحديات (تجاه الضوء، الصوت، الملمس) غالبًا تُهمل أو تُفسَّر خطأً كـ"دلع" أو "حساسية زايدة".</w:t>
+        <w:t>الحساسيات الحسية عند الفتيات التوحديات (تجاه الضوء، الصوت، الملمس، الروائح، والازدحام الحركي) غالبًا تُهمل أو تُفسَّر خطأً كـ"دلع" أو "حساسية زايدة" أو حتى "تصنّع"، لأنها لا تنفجر بشكل واضح أمام الآخرين — بل تُكتَم وتتراكم طوال اليوم بصمت.</w:t>
       </w:r>
     </w:p>
     <w:p>
@@ -1279,7 +1297,104 @@
           <w:sz w:val="24"/>
           <w:rtl/>
         </w:rPr>
-        <w:t>فتاة تتحمل بصمت صوت جرس المدرسة أو إضاءة الفصل المزعجة طوال اليوم الدراسي، وتكتم شكواها لأنها تعلّمت أنها "لازم تتصرف طبيعي" أمام الآخرين.</w:t>
+        <w:t>تخيلوا يوم دراسي كامل لفتاة توحدية: من لحظة دخولها الباب تصطدم بضجيج الممر المزدحم، ثم تجلس تحت إضاءة فلورية تومض بشكل لا يلاحظه أغلب زملائها، وتشعر طوال الحصة بملصق الملابس (Tag) يحكّ رقبتها فلا تقدر تركّز على الدرس، وفي الاستراحة تصلها رائحة عطر قوية من زميلة بجانبها فتشعر بغثيان خفيف، وفي الطابور تُلمس من كل جانب دون سابق إنذار. كل واحد من هذه المواقف بمفرده قد يبدو تافهًا، لكنها تتراكم فوق بعضها ساعة بعد ساعة — وبحلول وقت رجوعها للبيت، تكون قد استنفدت كل طاقتها على التحمّل الصامت، فتنهار فجأة أو تنسحب تمامًا دون أن يفهم أهلها السبب.</w:t>
+      </w:r>
+    </w:p>
+    <w:p>
+      <w:pPr>
+        <w:spacing w:after="80"/>
+        <w:jc w:val="right"/>
+        <w:bidi/>
+      </w:pPr>
+      <w:r>
+        <w:rPr>
+          <w:rFonts w:ascii="Arial" w:hAnsi="Arial"/>
+          <w:b/>
+          <w:color w:val="B8960C"/>
+          <w:sz w:val="23"/>
+          <w:rtl/>
+        </w:rPr>
+        <w:t>أمثلة يومية على الحساسيات الحسية:</w:t>
+      </w:r>
+    </w:p>
+    <w:p>
+      <w:pPr>
+        <w:pStyle w:val="ListBullet"/>
+        <w:spacing w:after="60"/>
+        <w:jc w:val="right"/>
+        <w:bidi/>
+      </w:pPr>
+      <w:r>
+        <w:rPr>
+          <w:rFonts w:ascii="Arial" w:hAnsi="Arial"/>
+          <w:sz w:val="22"/>
+          <w:rtl/>
+        </w:rPr>
+        <w:t>السمع: جرس المدرسة، ضجيج الكافتيريا، صرير الكراسي، الأصوات المفاجئة كصفارة التنبيه أو التصفيق الجماعي.</w:t>
+      </w:r>
+    </w:p>
+    <w:p>
+      <w:pPr>
+        <w:pStyle w:val="ListBullet"/>
+        <w:spacing w:after="60"/>
+        <w:jc w:val="right"/>
+        <w:bidi/>
+      </w:pPr>
+      <w:r>
+        <w:rPr>
+          <w:rFonts w:ascii="Arial" w:hAnsi="Arial"/>
+          <w:sz w:val="22"/>
+          <w:rtl/>
+        </w:rPr>
+        <w:t>البصر: الإضاءة الفلورية الوامضة، الشاشات الساطعة، الجدران المزدحمة بالألوان والملصقات.</w:t>
+      </w:r>
+    </w:p>
+    <w:p>
+      <w:pPr>
+        <w:pStyle w:val="ListBullet"/>
+        <w:spacing w:after="60"/>
+        <w:jc w:val="right"/>
+        <w:bidi/>
+      </w:pPr>
+      <w:r>
+        <w:rPr>
+          <w:rFonts w:ascii="Arial" w:hAnsi="Arial"/>
+          <w:sz w:val="22"/>
+          <w:rtl/>
+        </w:rPr>
+        <w:t>اللمس: ملصقات الملابس (Tags)، خيوط الجوارب الضيقة، ملمس أطعمة معينة، لمسة عرضية غير متوقعة من زميل بالممر.</w:t>
+      </w:r>
+    </w:p>
+    <w:p>
+      <w:pPr>
+        <w:pStyle w:val="ListBullet"/>
+        <w:spacing w:after="60"/>
+        <w:jc w:val="right"/>
+        <w:bidi/>
+      </w:pPr>
+      <w:r>
+        <w:rPr>
+          <w:rFonts w:ascii="Arial" w:hAnsi="Arial"/>
+          <w:sz w:val="22"/>
+          <w:rtl/>
+        </w:rPr>
+        <w:t>الشم: العطور القوية، رائحة معقم اليدين أو منظفات الفصل، روائح الكافتيريا المختلطة.</w:t>
+      </w:r>
+    </w:p>
+    <w:p>
+      <w:pPr>
+        <w:pStyle w:val="ListBullet"/>
+        <w:spacing w:after="60"/>
+        <w:jc w:val="right"/>
+        <w:bidi/>
+      </w:pPr>
+      <w:r>
+        <w:rPr>
+          <w:rFonts w:ascii="Arial" w:hAnsi="Arial"/>
+          <w:sz w:val="22"/>
+          <w:rtl/>
+        </w:rPr>
+        <w:t>الحركة والتوازن (Proprioception): الازدحام في الممرات والطوابير، حصص الرياضة، الوقوف القريب جدًا من الآخرين.</w:t>
       </w:r>
     </w:p>
     <w:p>
@@ -1305,7 +1420,7 @@
           <w:sz w:val="24"/>
           <w:rtl/>
         </w:rPr>
-        <w:t>نفس نمط التمويه ينطبق هنا: الفتيات يتعلّمن يكتمن ردة فعلهن الحسية بدل التعبير عنها بوضوح، كما قد يفعل الأولاد، فتبقى معاناتهن غير مرئية للمعلمين والأهل.</w:t>
+        <w:t>نفس نمط التمويه ينطبق هنا: الفتيات يتعلّمن يكتمن ردة فعلهن الحسية بدل التعبير عنها بوضوح كما قد يفعل الأولاد، فتبقى معاناتهن غير مرئية للمعلمين والأهل. والسبب الأعمق فسيولوجي: الجهاز العصبي عند الشخص التوحدي غالبًا يعالج المدخلات الحسية بعتبة مختلفة — إما حساسية مفرطة (كل صوت أو ضوء يصل بشدة مضاعفة) أو حساسية منخفضة تدفعه للبحث عن مؤثرات حسية أقوى. والأخطر أن هذه المحفزات لا تُفرَّغ فور حدوثها، بل تتراكم كـ"حِمل حسي" (Sensory Load) طوال اليوم حتى تتجاوز طاقة التحمّل.</w:t>
       </w:r>
     </w:p>
     <w:p>
@@ -1331,7 +1446,104 @@
           <w:sz w:val="24"/>
           <w:rtl/>
         </w:rPr>
-        <w:t>فهم استباقي للحساسيات الحسية والقلق المرتبط بها، مع توفير بيئة صفية مرنة (سماعات عازلة، إضاءة قابلة للتعديل، ركن هادئ) بدل انتظار انهيار واضح للتدخل.</w:t>
+        <w:t>الحل الحقيقي مو انتظار الانهيار عشان نتدخّل، هو بناء دعم استباقي على عدة مستويات: من أدوات فورية بسيطة، إلى تعديلات بيئية دائمة، إلى خطة حسية فردية مبنية على تقييم مختص.</w:t>
+      </w:r>
+    </w:p>
+    <w:p>
+      <w:pPr>
+        <w:spacing w:after="80"/>
+        <w:jc w:val="right"/>
+        <w:bidi/>
+      </w:pPr>
+      <w:r>
+        <w:rPr>
+          <w:rFonts w:ascii="Arial" w:hAnsi="Arial"/>
+          <w:b/>
+          <w:color w:val="B8960C"/>
+          <w:sz w:val="23"/>
+          <w:rtl/>
+        </w:rPr>
+        <w:t>خطوات الحل بالتفصيل:</w:t>
+      </w:r>
+    </w:p>
+    <w:p>
+      <w:pPr>
+        <w:pStyle w:val="ListBullet"/>
+        <w:spacing w:after="60"/>
+        <w:jc w:val="right"/>
+        <w:bidi/>
+      </w:pPr>
+      <w:r>
+        <w:rPr>
+          <w:rFonts w:ascii="Arial" w:hAnsi="Arial"/>
+          <w:sz w:val="22"/>
+          <w:rtl/>
+        </w:rPr>
+        <w:t>أدوات فورية: سماعات عازلة للضوضاء (Ear Defenders)، نظارة شمسية خفيفة داخل الصف لو الضوء مزعج، السماح بارتداء ملابس بدون ملصقات أو بخامة مريحة، فسحة حسية قصيرة (٥ دقائق) عند الحاجة.</w:t>
+      </w:r>
+    </w:p>
+    <w:p>
+      <w:pPr>
+        <w:pStyle w:val="ListBullet"/>
+        <w:spacing w:after="60"/>
+        <w:jc w:val="right"/>
+        <w:bidi/>
+      </w:pPr>
+      <w:r>
+        <w:rPr>
+          <w:rFonts w:ascii="Arial" w:hAnsi="Arial"/>
+          <w:sz w:val="22"/>
+          <w:rtl/>
+        </w:rPr>
+        <w:t>تعديلات بيئية دائمة: إضاءة طبيعية أو قابلة للتعديل بدل الفلورسنت، مقعد بعيد عن الباب أو الممر المزدحم، توفير "ركن هادئ" بالمدرسة يمكن اللجوء إليه دون استئذان معقّد.</w:t>
+      </w:r>
+    </w:p>
+    <w:p>
+      <w:pPr>
+        <w:pStyle w:val="ListBullet"/>
+        <w:spacing w:after="60"/>
+        <w:jc w:val="right"/>
+        <w:bidi/>
+      </w:pPr>
+      <w:r>
+        <w:rPr>
+          <w:rFonts w:ascii="Arial" w:hAnsi="Arial"/>
+          <w:sz w:val="22"/>
+          <w:rtl/>
+        </w:rPr>
+        <w:t>نظام تواصل متفق عليه مسبقًا: بطاقة أو إشارة صامتة (مثل رفع بطاقة ملوّنة) تدل إن الطالبة وصلت لحد التحمّل، بدل ما تُضطر تشرح بالكلام في لحظة الضغط نفسها.</w:t>
+      </w:r>
+    </w:p>
+    <w:p>
+      <w:pPr>
+        <w:pStyle w:val="ListBullet"/>
+        <w:spacing w:after="60"/>
+        <w:jc w:val="right"/>
+        <w:bidi/>
+      </w:pPr>
+      <w:r>
+        <w:rPr>
+          <w:rFonts w:ascii="Arial" w:hAnsi="Arial"/>
+          <w:sz w:val="22"/>
+          <w:rtl/>
+        </w:rPr>
+        <w:t>خطة حسية فردية (Sensory Profile) بالتعاون مع أخصائي علاج وظيفي (Occupational Therapist): تحديد المحفزات الدقيقة لكل شخص، وبناء "حِمية حسية" (Sensory Diet) من أنشطة منظِّمة (حركة، ضغط عميق، فترات راحة) موزّعة على اليوم بدل تركها للصدفة.</w:t>
+      </w:r>
+    </w:p>
+    <w:p>
+      <w:pPr>
+        <w:pStyle w:val="ListBullet"/>
+        <w:spacing w:after="60"/>
+        <w:jc w:val="right"/>
+        <w:bidi/>
+      </w:pPr>
+      <w:r>
+        <w:rPr>
+          <w:rFonts w:ascii="Arial" w:hAnsi="Arial"/>
+          <w:sz w:val="22"/>
+          <w:rtl/>
+        </w:rPr>
+        <w:t>تثقيف الأهل والمعلمين: الانسحاب الهادئ أو "التصرف الغريب" بعد المدرسة ليس دلعًا — هو غالبًا علامة على تراكم حمل حسي كامل اليوم يحتاج تفريغًا آمنًا في البيت، لا مزيدًا من الضغط أو الأسئلة فور الوصول.</w:t>
       </w:r>
     </w:p>
     <w:p>
@@ -1349,7 +1561,7 @@
           <w:sz w:val="21"/>
           <w:rtl/>
         </w:rPr>
-        <w:t>المصدر: دليل Nasen — Girls and Autism: Flying Under the Radar (Egerton &amp; Carpenter).</w:t>
+        <w:t>المصدر: دليل Nasen — Girls and Autism: Flying Under the Radar (Egerton &amp; Carpenter) يشير إلى الحساسيات الحسية والقلق المرتبط بها كأحد المجالات الأساسية التي يجب على المدارس فهمها وإدارتها. الأمثلة والخطوات العملية التفصيلية أعلاه مبنية على ممارسات شائعة في العلاج الوظيفي ودعم التنظيم الحسي (Sensory Processing Support)، وتُستخدم عادة كمكمّل لتوصيات الدليل، لا كجزء حرفي منه.</w:t>
       </w:r>
     </w:p>
     <w:p>
@@ -1367,7 +1579,7 @@
           <w:sz w:val="21"/>
           <w:rtl/>
         </w:rPr>
-        <w:t>كابشن مقترح: "صمتها عن الإزعاج الحسي مو راحة… هو تحمّل صامت." #حساسية_حسية #بيئة_داعمة</w:t>
+        <w:t>كابشن مقترح: "صمتها عن الإزعاج الحسي مو راحة… هو تحمّل صامت يتراكم ساعة بساعة." #حساسية_حسية #بيئة_داعمة #تنظيم_حسي</w:t>
       </w:r>
     </w:p>
     <w:p>

</xml_diff>